<commit_message>
Align internship report formatting with reference
</commit_message>
<xml_diff>
--- a/report/ToxiGuard_Internship_Report_Updated.docx
+++ b/report/ToxiGuard_Internship_Report_Updated.docx
@@ -5,6 +5,40 @@
     <w:p>
       <w:pPr>
         <w:spacing w:before="240"/>
+        <w:jc w:val="center"/>
+      </w:pPr>
+      <w:r>
+        <w:rPr>
+          <w:sz w:val="26"/>
+        </w:rPr>
+        <w:t>Summer Internship Report on</w:t>
+      </w:r>
+    </w:p>
+    <w:p>
+      <w:pPr>
+        <w:spacing w:after="240"/>
+        <w:jc w:val="center"/>
+      </w:pPr>
+      <w:r>
+        <w:rPr>
+          <w:b/>
+          <w:color w:val="1F497D"/>
+          <w:sz w:val="40"/>
+        </w:rPr>
+        <w:t>TOXIGUARD: An NLP Based Machine Learning Framework for Cyberbullying and Toxic Comment Detection</w:t>
+      </w:r>
+    </w:p>
+    <w:p>
+      <w:pPr>
+        <w:jc w:val="center"/>
+      </w:pPr>
+      <w:r>
+        <w:t>Submitted in partial fulfillment of the requirements for the award of the degree of</w:t>
+      </w:r>
+    </w:p>
+    <w:p>
+      <w:pPr>
+        <w:spacing w:after="320"/>
         <w:jc w:val="center"/>
       </w:pPr>
       <w:r>
@@ -12,42 +46,12 @@
           <w:b/>
           <w:sz w:val="32"/>
         </w:rPr>
-        <w:t>A SUMMER INTERNSHIP REPORT</w:t>
+        <w:t>MASTER OF COMPUTER APPLICATIONS</w:t>
       </w:r>
     </w:p>
     <w:p>
       <w:pPr>
-        <w:spacing w:after="240"/>
-        <w:jc w:val="center"/>
-      </w:pPr>
-      <w:r>
-        <w:t>ON</w:t>
-      </w:r>
-    </w:p>
-    <w:p>
-      <w:pPr>
-        <w:spacing w:after="320"/>
-        <w:jc w:val="center"/>
-      </w:pPr>
-      <w:r>
-        <w:rPr>
-          <w:b/>
-          <w:sz w:val="32"/>
-        </w:rPr>
-        <w:t>TOXIGUARD: AN NLP BASED MACHINE LEARNING FRAMEWORK FOR CYBERBULLYING AND TOXIC COMMENT DETECTION</w:t>
-      </w:r>
-    </w:p>
-    <w:p>
-      <w:pPr>
-        <w:jc w:val="center"/>
-      </w:pPr>
-      <w:r>
-        <w:t>Submitted in partial fulfillment of the requirements for the award of the degree of</w:t>
-      </w:r>
-    </w:p>
-    <w:p>
-      <w:pPr>
-        <w:spacing w:after="320"/>
+        <w:spacing w:after="100"/>
         <w:jc w:val="center"/>
       </w:pPr>
       <w:r>
@@ -55,21 +59,52 @@
           <w:b/>
           <w:sz w:val="28"/>
         </w:rPr>
-        <w:t>MASTER OF COMPUTER APPLICATIONS (MCA)</w:t>
+        <w:t>Submitted By</w:t>
       </w:r>
     </w:p>
     <w:p>
       <w:pPr>
-        <w:spacing w:after="100"/>
+        <w:spacing w:after="20"/>
         <w:jc w:val="center"/>
       </w:pPr>
       <w:r>
-        <w:t>Submitted by</w:t>
+        <w:rPr>
+          <w:b/>
+          <w:color w:val="C00000"/>
+          <w:sz w:val="36"/>
+        </w:rPr>
+        <w:t>Anumathi Singh</w:t>
       </w:r>
     </w:p>
     <w:p>
       <w:pPr>
+        <w:spacing w:after="320"/>
+        <w:jc w:val="center"/>
+      </w:pPr>
+      <w:r>
+        <w:rPr>
+          <w:b/>
+          <w:color w:val="C00000"/>
+          <w:sz w:val="36"/>
+        </w:rPr>
+        <w:t>Roll no: 160125862006</w:t>
+      </w:r>
+    </w:p>
+    <w:p>
+      <w:pPr>
         <w:spacing w:after="80"/>
+        <w:jc w:val="center"/>
+      </w:pPr>
+      <w:r>
+        <w:rPr>
+          <w:b/>
+        </w:rPr>
+        <w:t>Under the Esteemed Internal Guidance of</w:t>
+      </w:r>
+    </w:p>
+    <w:p>
+      <w:pPr>
+        <w:spacing w:after="20"/>
         <w:jc w:val="center"/>
       </w:pPr>
       <w:r>
@@ -77,45 +112,30 @@
           <w:b/>
           <w:sz w:val="30"/>
         </w:rPr>
-        <w:t>ANUMATHI SINGH</w:t>
+        <w:t>Dr. B. Indira</w:t>
       </w:r>
     </w:p>
     <w:p>
       <w:pPr>
-        <w:spacing w:after="320"/>
-        <w:jc w:val="center"/>
-      </w:pPr>
-      <w:r>
-        <w:t>Hall Ticket No: 160125862006</w:t>
-      </w:r>
-    </w:p>
-    <w:p>
-      <w:pPr>
-        <w:spacing w:after="100"/>
-        <w:jc w:val="center"/>
-      </w:pPr>
-      <w:r>
-        <w:t>Under the Guidance of</w:t>
-      </w:r>
-    </w:p>
-    <w:p>
-      <w:pPr>
-        <w:spacing w:after="40"/>
+        <w:spacing w:after="20"/>
         <w:jc w:val="center"/>
       </w:pPr>
       <w:r>
         <w:rPr>
-          <w:i/>
+          <w:b/>
         </w:rPr>
-        <w:t>Dr. B. Indira</w:t>
+        <w:t>Associate Professor</w:t>
       </w:r>
     </w:p>
     <w:p>
       <w:pPr>
-        <w:spacing w:after="240"/>
+        <w:spacing w:after="220"/>
         <w:jc w:val="center"/>
       </w:pPr>
       <w:r>
+        <w:rPr>
+          <w:b/>
+        </w:rPr>
         <w:t>Department of MCA, CBIT (A)</w:t>
       </w:r>
     </w:p>
@@ -129,7 +149,7 @@
           <w:noProof/>
         </w:rPr>
         <w:drawing>
-          <wp:inline distT="0" distB="0" distL="0" distR="0" wp14:anchorId="7FBD772D" wp14:editId="2291F74E">
+          <wp:inline distT="0" distB="0" distL="0" distR="0" wp14:anchorId="16EC9F02" wp14:editId="0E9CD3EA">
             <wp:extent cx="987552" cy="987552"/>
             <wp:effectExtent l="0" t="0" r="0" b="0"/>
             <wp:docPr id="1" name="Picture 1"/>
@@ -185,6 +205,7 @@
       <w:r>
         <w:rPr>
           <w:b/>
+          <w:sz w:val="26"/>
         </w:rPr>
         <w:t>Chaitanya Bharathi Institute of Technology (Autonomous)</w:t>
       </w:r>
@@ -223,7 +244,7 @@
         </w:rPr>
         <w:lastRenderedPageBreak/>
         <w:drawing>
-          <wp:inline distT="0" distB="0" distL="0" distR="0" wp14:anchorId="54C92BD9" wp14:editId="44A40CBB">
+          <wp:inline distT="0" distB="0" distL="0" distR="0" wp14:anchorId="317A76B9" wp14:editId="42297252">
             <wp:extent cx="5486400" cy="994410"/>
             <wp:effectExtent l="0" t="0" r="0" b="0"/>
             <wp:docPr id="2" name="Picture 2"/>
@@ -268,6 +289,7 @@
         <w:rPr>
           <w:b/>
           <w:sz w:val="32"/>
+          <w:u w:val="single"/>
         </w:rPr>
         <w:t>CERTIFICATE</w:t>
       </w:r>
@@ -327,9 +349,10 @@
             </w:pPr>
             <w:r>
               <w:rPr>
-                <w:b/>
+                <w:color w:val="C00000"/>
+                <w:sz w:val="26"/>
               </w:rPr>
-              <w:t>Internal Guide</w:t>
+              <w:t>Internship Internal Guide</w:t>
             </w:r>
           </w:p>
           <w:p>
@@ -338,6 +361,9 @@
               <w:jc w:val="left"/>
             </w:pPr>
             <w:r>
+              <w:rPr>
+                <w:b/>
+              </w:rPr>
               <w:t>Dr. B. Indira</w:t>
             </w:r>
           </w:p>
@@ -347,6 +373,9 @@
               <w:jc w:val="left"/>
             </w:pPr>
             <w:r>
+              <w:rPr>
+                <w:b/>
+              </w:rPr>
               <w:t>Associate Professor</w:t>
             </w:r>
           </w:p>
@@ -356,6 +385,9 @@
               <w:jc w:val="left"/>
             </w:pPr>
             <w:r>
+              <w:rPr>
+                <w:b/>
+              </w:rPr>
               <w:t>Dept. of MCA, CBIT (A), Hyderabad</w:t>
             </w:r>
           </w:p>
@@ -377,9 +409,10 @@
             </w:pPr>
             <w:r>
               <w:rPr>
-                <w:b/>
+                <w:color w:val="C00000"/>
+                <w:sz w:val="26"/>
               </w:rPr>
-              <w:t>Head of Department</w:t>
+              <w:t>Head of the Department</w:t>
             </w:r>
           </w:p>
           <w:p>
@@ -388,6 +421,9 @@
               <w:jc w:val="left"/>
             </w:pPr>
             <w:r>
+              <w:rPr>
+                <w:b/>
+              </w:rPr>
               <w:t>Dr. B. Indira</w:t>
             </w:r>
           </w:p>
@@ -397,6 +433,9 @@
               <w:jc w:val="left"/>
             </w:pPr>
             <w:r>
+              <w:rPr>
+                <w:b/>
+              </w:rPr>
               <w:t>Associate Professor</w:t>
             </w:r>
           </w:p>
@@ -406,6 +445,9 @@
               <w:jc w:val="left"/>
             </w:pPr>
             <w:r>
+              <w:rPr>
+                <w:b/>
+              </w:rPr>
               <w:t>Dept. of MCA, CBIT (A), Hyderabad</w:t>
             </w:r>
           </w:p>
@@ -446,7 +488,7 @@
           <w:noProof/>
         </w:rPr>
         <w:drawing>
-          <wp:inline distT="0" distB="0" distL="0" distR="0" wp14:anchorId="64894729" wp14:editId="017BD8F3">
+          <wp:inline distT="0" distB="0" distL="0" distR="0" wp14:anchorId="4B1388D5" wp14:editId="47753370">
             <wp:extent cx="5486400" cy="3880104"/>
             <wp:effectExtent l="0" t="0" r="0" b="0"/>
             <wp:docPr id="3" name="Picture 3"/>
@@ -634,7 +676,7 @@
       <w:r>
         <w:fldChar w:fldCharType="separate"/>
       </w:r>
-      <w:hyperlink w:anchor="_Toc241671782" w:history="1">
+      <w:hyperlink w:anchor="_Toc242116402" w:history="1">
         <w:r>
           <w:rPr>
             <w:rStyle w:val="Hyperlink"/>
@@ -662,7 +704,7 @@
             <w:noProof/>
             <w:webHidden/>
           </w:rPr>
-          <w:instrText xml:space="preserve"> PAGEREF _Toc241671782 \h </w:instrText>
+          <w:instrText xml:space="preserve"> PAGEREF _Toc242116402 \h </w:instrText>
         </w:r>
         <w:r>
           <w:rPr>
@@ -708,7 +750,7 @@
           <w14:ligatures w14:val="standardContextual"/>
         </w:rPr>
       </w:pPr>
-      <w:hyperlink w:anchor="_Toc241671783" w:history="1">
+      <w:hyperlink w:anchor="_Toc242116403" w:history="1">
         <w:r>
           <w:rPr>
             <w:rStyle w:val="Hyperlink"/>
@@ -736,7 +778,7 @@
             <w:noProof/>
             <w:webHidden/>
           </w:rPr>
-          <w:instrText xml:space="preserve"> PAGEREF _Toc241671783 \h </w:instrText>
+          <w:instrText xml:space="preserve"> PAGEREF _Toc242116403 \h </w:instrText>
         </w:r>
         <w:r>
           <w:rPr>
@@ -782,7 +824,7 @@
           <w14:ligatures w14:val="standardContextual"/>
         </w:rPr>
       </w:pPr>
-      <w:hyperlink w:anchor="_Toc241671784" w:history="1">
+      <w:hyperlink w:anchor="_Toc242116404" w:history="1">
         <w:r>
           <w:rPr>
             <w:rStyle w:val="Hyperlink"/>
@@ -810,7 +852,7 @@
             <w:noProof/>
             <w:webHidden/>
           </w:rPr>
-          <w:instrText xml:space="preserve"> PAGEREF _Toc241671784 \h </w:instrText>
+          <w:instrText xml:space="preserve"> PAGEREF _Toc242116404 \h </w:instrText>
         </w:r>
         <w:r>
           <w:rPr>
@@ -856,7 +898,7 @@
           <w14:ligatures w14:val="standardContextual"/>
         </w:rPr>
       </w:pPr>
-      <w:hyperlink w:anchor="_Toc241671785" w:history="1">
+      <w:hyperlink w:anchor="_Toc242116405" w:history="1">
         <w:r>
           <w:rPr>
             <w:rStyle w:val="Hyperlink"/>
@@ -884,7 +926,7 @@
             <w:noProof/>
             <w:webHidden/>
           </w:rPr>
-          <w:instrText xml:space="preserve"> PAGEREF _Toc241671785 \h </w:instrText>
+          <w:instrText xml:space="preserve"> PAGEREF _Toc242116405 \h </w:instrText>
         </w:r>
         <w:r>
           <w:rPr>
@@ -930,7 +972,7 @@
           <w14:ligatures w14:val="standardContextual"/>
         </w:rPr>
       </w:pPr>
-      <w:hyperlink w:anchor="_Toc241671786" w:history="1">
+      <w:hyperlink w:anchor="_Toc242116406" w:history="1">
         <w:r>
           <w:rPr>
             <w:rStyle w:val="Hyperlink"/>
@@ -958,7 +1000,7 @@
             <w:noProof/>
             <w:webHidden/>
           </w:rPr>
-          <w:instrText xml:space="preserve"> PAGEREF _Toc241671786 \h </w:instrText>
+          <w:instrText xml:space="preserve"> PAGEREF _Toc242116406 \h </w:instrText>
         </w:r>
         <w:r>
           <w:rPr>
@@ -1004,7 +1046,7 @@
           <w14:ligatures w14:val="standardContextual"/>
         </w:rPr>
       </w:pPr>
-      <w:hyperlink w:anchor="_Toc241671787" w:history="1">
+      <w:hyperlink w:anchor="_Toc242116407" w:history="1">
         <w:r>
           <w:rPr>
             <w:rStyle w:val="Hyperlink"/>
@@ -1032,7 +1074,7 @@
             <w:noProof/>
             <w:webHidden/>
           </w:rPr>
-          <w:instrText xml:space="preserve"> PAGEREF _Toc241671787 \h </w:instrText>
+          <w:instrText xml:space="preserve"> PAGEREF _Toc242116407 \h </w:instrText>
         </w:r>
         <w:r>
           <w:rPr>
@@ -1078,7 +1120,7 @@
           <w14:ligatures w14:val="standardContextual"/>
         </w:rPr>
       </w:pPr>
-      <w:hyperlink w:anchor="_Toc241671788" w:history="1">
+      <w:hyperlink w:anchor="_Toc242116408" w:history="1">
         <w:r>
           <w:rPr>
             <w:rStyle w:val="Hyperlink"/>
@@ -1106,7 +1148,7 @@
             <w:noProof/>
             <w:webHidden/>
           </w:rPr>
-          <w:instrText xml:space="preserve"> PAGEREF _Toc241671788 \h </w:instrText>
+          <w:instrText xml:space="preserve"> PAGEREF _Toc242116408 \h </w:instrText>
         </w:r>
         <w:r>
           <w:rPr>
@@ -1152,7 +1194,7 @@
           <w14:ligatures w14:val="standardContextual"/>
         </w:rPr>
       </w:pPr>
-      <w:hyperlink w:anchor="_Toc241671789" w:history="1">
+      <w:hyperlink w:anchor="_Toc242116409" w:history="1">
         <w:r>
           <w:rPr>
             <w:rStyle w:val="Hyperlink"/>
@@ -1180,7 +1222,7 @@
             <w:noProof/>
             <w:webHidden/>
           </w:rPr>
-          <w:instrText xml:space="preserve"> PAGEREF _Toc241671789 \h </w:instrText>
+          <w:instrText xml:space="preserve"> PAGEREF _Toc242116409 \h </w:instrText>
         </w:r>
         <w:r>
           <w:rPr>
@@ -1226,7 +1268,7 @@
           <w14:ligatures w14:val="standardContextual"/>
         </w:rPr>
       </w:pPr>
-      <w:hyperlink w:anchor="_Toc241671790" w:history="1">
+      <w:hyperlink w:anchor="_Toc242116410" w:history="1">
         <w:r>
           <w:rPr>
             <w:rStyle w:val="Hyperlink"/>
@@ -1254,7 +1296,7 @@
             <w:noProof/>
             <w:webHidden/>
           </w:rPr>
-          <w:instrText xml:space="preserve"> PAGEREF _Toc241671790 \h </w:instrText>
+          <w:instrText xml:space="preserve"> PAGEREF _Toc242116410 \h </w:instrText>
         </w:r>
         <w:r>
           <w:rPr>
@@ -1300,7 +1342,7 @@
           <w14:ligatures w14:val="standardContextual"/>
         </w:rPr>
       </w:pPr>
-      <w:hyperlink w:anchor="_Toc241671791" w:history="1">
+      <w:hyperlink w:anchor="_Toc242116411" w:history="1">
         <w:r>
           <w:rPr>
             <w:rStyle w:val="Hyperlink"/>
@@ -1328,7 +1370,7 @@
             <w:noProof/>
             <w:webHidden/>
           </w:rPr>
-          <w:instrText xml:space="preserve"> PAGEREF _Toc241671791 \h </w:instrText>
+          <w:instrText xml:space="preserve"> PAGEREF _Toc242116411 \h </w:instrText>
         </w:r>
         <w:r>
           <w:rPr>
@@ -1374,7 +1416,7 @@
           <w14:ligatures w14:val="standardContextual"/>
         </w:rPr>
       </w:pPr>
-      <w:hyperlink w:anchor="_Toc241671792" w:history="1">
+      <w:hyperlink w:anchor="_Toc242116412" w:history="1">
         <w:r>
           <w:rPr>
             <w:rStyle w:val="Hyperlink"/>
@@ -1402,7 +1444,7 @@
             <w:noProof/>
             <w:webHidden/>
           </w:rPr>
-          <w:instrText xml:space="preserve"> PAGEREF _Toc241671792 \h </w:instrText>
+          <w:instrText xml:space="preserve"> PAGEREF _Toc242116412 \h </w:instrText>
         </w:r>
         <w:r>
           <w:rPr>
@@ -1448,7 +1490,7 @@
           <w14:ligatures w14:val="standardContextual"/>
         </w:rPr>
       </w:pPr>
-      <w:hyperlink w:anchor="_Toc241671793" w:history="1">
+      <w:hyperlink w:anchor="_Toc242116413" w:history="1">
         <w:r>
           <w:rPr>
             <w:rStyle w:val="Hyperlink"/>
@@ -1476,7 +1518,7 @@
             <w:noProof/>
             <w:webHidden/>
           </w:rPr>
-          <w:instrText xml:space="preserve"> PAGEREF _Toc241671793 \h </w:instrText>
+          <w:instrText xml:space="preserve"> PAGEREF _Toc242116413 \h </w:instrText>
         </w:r>
         <w:r>
           <w:rPr>
@@ -1522,7 +1564,7 @@
           <w14:ligatures w14:val="standardContextual"/>
         </w:rPr>
       </w:pPr>
-      <w:hyperlink w:anchor="_Toc241671794" w:history="1">
+      <w:hyperlink w:anchor="_Toc242116414" w:history="1">
         <w:r>
           <w:rPr>
             <w:rStyle w:val="Hyperlink"/>
@@ -1550,7 +1592,7 @@
             <w:noProof/>
             <w:webHidden/>
           </w:rPr>
-          <w:instrText xml:space="preserve"> PAGEREF _Toc241671794 \h </w:instrText>
+          <w:instrText xml:space="preserve"> PAGEREF _Toc242116414 \h </w:instrText>
         </w:r>
         <w:r>
           <w:rPr>
@@ -1596,7 +1638,7 @@
           <w14:ligatures w14:val="standardContextual"/>
         </w:rPr>
       </w:pPr>
-      <w:hyperlink w:anchor="_Toc241671795" w:history="1">
+      <w:hyperlink w:anchor="_Toc242116415" w:history="1">
         <w:r>
           <w:rPr>
             <w:rStyle w:val="Hyperlink"/>
@@ -1624,7 +1666,7 @@
             <w:noProof/>
             <w:webHidden/>
           </w:rPr>
-          <w:instrText xml:space="preserve"> PAGEREF _Toc241671795 \h </w:instrText>
+          <w:instrText xml:space="preserve"> PAGEREF _Toc242116415 \h </w:instrText>
         </w:r>
         <w:r>
           <w:rPr>
@@ -1670,7 +1712,7 @@
           <w14:ligatures w14:val="standardContextual"/>
         </w:rPr>
       </w:pPr>
-      <w:hyperlink w:anchor="_Toc241671796" w:history="1">
+      <w:hyperlink w:anchor="_Toc242116416" w:history="1">
         <w:r>
           <w:rPr>
             <w:rStyle w:val="Hyperlink"/>
@@ -1698,7 +1740,7 @@
             <w:noProof/>
             <w:webHidden/>
           </w:rPr>
-          <w:instrText xml:space="preserve"> PAGEREF _Toc241671796 \h </w:instrText>
+          <w:instrText xml:space="preserve"> PAGEREF _Toc242116416 \h </w:instrText>
         </w:r>
         <w:r>
           <w:rPr>
@@ -1744,7 +1786,7 @@
           <w14:ligatures w14:val="standardContextual"/>
         </w:rPr>
       </w:pPr>
-      <w:hyperlink w:anchor="_Toc241671797" w:history="1">
+      <w:hyperlink w:anchor="_Toc242116417" w:history="1">
         <w:r>
           <w:rPr>
             <w:rStyle w:val="Hyperlink"/>
@@ -1772,7 +1814,7 @@
             <w:noProof/>
             <w:webHidden/>
           </w:rPr>
-          <w:instrText xml:space="preserve"> PAGEREF _Toc241671797 \h </w:instrText>
+          <w:instrText xml:space="preserve"> PAGEREF _Toc242116417 \h </w:instrText>
         </w:r>
         <w:r>
           <w:rPr>
@@ -1818,7 +1860,7 @@
           <w14:ligatures w14:val="standardContextual"/>
         </w:rPr>
       </w:pPr>
-      <w:hyperlink w:anchor="_Toc241671798" w:history="1">
+      <w:hyperlink w:anchor="_Toc242116418" w:history="1">
         <w:r>
           <w:rPr>
             <w:rStyle w:val="Hyperlink"/>
@@ -1846,7 +1888,7 @@
             <w:noProof/>
             <w:webHidden/>
           </w:rPr>
-          <w:instrText xml:space="preserve"> PAGEREF _Toc241671798 \h </w:instrText>
+          <w:instrText xml:space="preserve"> PAGEREF _Toc242116418 \h </w:instrText>
         </w:r>
         <w:r>
           <w:rPr>
@@ -1892,7 +1934,7 @@
           <w14:ligatures w14:val="standardContextual"/>
         </w:rPr>
       </w:pPr>
-      <w:hyperlink w:anchor="_Toc241671799" w:history="1">
+      <w:hyperlink w:anchor="_Toc242116419" w:history="1">
         <w:r>
           <w:rPr>
             <w:rStyle w:val="Hyperlink"/>
@@ -1920,7 +1962,7 @@
             <w:noProof/>
             <w:webHidden/>
           </w:rPr>
-          <w:instrText xml:space="preserve"> PAGEREF _Toc241671799 \h </w:instrText>
+          <w:instrText xml:space="preserve"> PAGEREF _Toc242116419 \h </w:instrText>
         </w:r>
         <w:r>
           <w:rPr>
@@ -1966,7 +2008,7 @@
           <w14:ligatures w14:val="standardContextual"/>
         </w:rPr>
       </w:pPr>
-      <w:hyperlink w:anchor="_Toc241671800" w:history="1">
+      <w:hyperlink w:anchor="_Toc242116420" w:history="1">
         <w:r>
           <w:rPr>
             <w:rStyle w:val="Hyperlink"/>
@@ -1994,7 +2036,7 @@
             <w:noProof/>
             <w:webHidden/>
           </w:rPr>
-          <w:instrText xml:space="preserve"> PAGEREF _Toc241671800 \h </w:instrText>
+          <w:instrText xml:space="preserve"> PAGEREF _Toc242116420 \h </w:instrText>
         </w:r>
         <w:r>
           <w:rPr>
@@ -2040,7 +2082,7 @@
           <w14:ligatures w14:val="standardContextual"/>
         </w:rPr>
       </w:pPr>
-      <w:hyperlink w:anchor="_Toc241671801" w:history="1">
+      <w:hyperlink w:anchor="_Toc242116421" w:history="1">
         <w:r>
           <w:rPr>
             <w:rStyle w:val="Hyperlink"/>
@@ -2068,7 +2110,7 @@
             <w:noProof/>
             <w:webHidden/>
           </w:rPr>
-          <w:instrText xml:space="preserve"> PAGEREF _Toc241671801 \h </w:instrText>
+          <w:instrText xml:space="preserve"> PAGEREF _Toc242116421 \h </w:instrText>
         </w:r>
         <w:r>
           <w:rPr>
@@ -2114,7 +2156,7 @@
           <w14:ligatures w14:val="standardContextual"/>
         </w:rPr>
       </w:pPr>
-      <w:hyperlink w:anchor="_Toc241671802" w:history="1">
+      <w:hyperlink w:anchor="_Toc242116422" w:history="1">
         <w:r>
           <w:rPr>
             <w:rStyle w:val="Hyperlink"/>
@@ -2142,7 +2184,7 @@
             <w:noProof/>
             <w:webHidden/>
           </w:rPr>
-          <w:instrText xml:space="preserve"> PAGEREF _Toc241671802 \h </w:instrText>
+          <w:instrText xml:space="preserve"> PAGEREF _Toc242116422 \h </w:instrText>
         </w:r>
         <w:r>
           <w:rPr>
@@ -2188,7 +2230,7 @@
           <w14:ligatures w14:val="standardContextual"/>
         </w:rPr>
       </w:pPr>
-      <w:hyperlink w:anchor="_Toc241671803" w:history="1">
+      <w:hyperlink w:anchor="_Toc242116423" w:history="1">
         <w:r>
           <w:rPr>
             <w:rStyle w:val="Hyperlink"/>
@@ -2216,7 +2258,7 @@
             <w:noProof/>
             <w:webHidden/>
           </w:rPr>
-          <w:instrText xml:space="preserve"> PAGEREF _Toc241671803 \h </w:instrText>
+          <w:instrText xml:space="preserve"> PAGEREF _Toc242116423 \h </w:instrText>
         </w:r>
         <w:r>
           <w:rPr>
@@ -2262,7 +2304,7 @@
           <w14:ligatures w14:val="standardContextual"/>
         </w:rPr>
       </w:pPr>
-      <w:hyperlink w:anchor="_Toc241671804" w:history="1">
+      <w:hyperlink w:anchor="_Toc242116424" w:history="1">
         <w:r>
           <w:rPr>
             <w:rStyle w:val="Hyperlink"/>
@@ -2290,7 +2332,7 @@
             <w:noProof/>
             <w:webHidden/>
           </w:rPr>
-          <w:instrText xml:space="preserve"> PAGEREF _Toc241671804 \h </w:instrText>
+          <w:instrText xml:space="preserve"> PAGEREF _Toc242116424 \h </w:instrText>
         </w:r>
         <w:r>
           <w:rPr>
@@ -2336,7 +2378,7 @@
           <w14:ligatures w14:val="standardContextual"/>
         </w:rPr>
       </w:pPr>
-      <w:hyperlink w:anchor="_Toc241671805" w:history="1">
+      <w:hyperlink w:anchor="_Toc242116425" w:history="1">
         <w:r>
           <w:rPr>
             <w:rStyle w:val="Hyperlink"/>
@@ -2364,7 +2406,7 @@
             <w:noProof/>
             <w:webHidden/>
           </w:rPr>
-          <w:instrText xml:space="preserve"> PAGEREF _Toc241671805 \h </w:instrText>
+          <w:instrText xml:space="preserve"> PAGEREF _Toc242116425 \h </w:instrText>
         </w:r>
         <w:r>
           <w:rPr>
@@ -2410,7 +2452,7 @@
           <w14:ligatures w14:val="standardContextual"/>
         </w:rPr>
       </w:pPr>
-      <w:hyperlink w:anchor="_Toc241671806" w:history="1">
+      <w:hyperlink w:anchor="_Toc242116426" w:history="1">
         <w:r>
           <w:rPr>
             <w:rStyle w:val="Hyperlink"/>
@@ -2438,7 +2480,7 @@
             <w:noProof/>
             <w:webHidden/>
           </w:rPr>
-          <w:instrText xml:space="preserve"> PAGEREF _Toc241671806 \h </w:instrText>
+          <w:instrText xml:space="preserve"> PAGEREF _Toc242116426 \h </w:instrText>
         </w:r>
         <w:r>
           <w:rPr>
@@ -2484,7 +2526,7 @@
           <w14:ligatures w14:val="standardContextual"/>
         </w:rPr>
       </w:pPr>
-      <w:hyperlink w:anchor="_Toc241671807" w:history="1">
+      <w:hyperlink w:anchor="_Toc242116427" w:history="1">
         <w:r>
           <w:rPr>
             <w:rStyle w:val="Hyperlink"/>
@@ -2512,7 +2554,7 @@
             <w:noProof/>
             <w:webHidden/>
           </w:rPr>
-          <w:instrText xml:space="preserve"> PAGEREF _Toc241671807 \h </w:instrText>
+          <w:instrText xml:space="preserve"> PAGEREF _Toc242116427 \h </w:instrText>
         </w:r>
         <w:r>
           <w:rPr>
@@ -2558,7 +2600,7 @@
           <w14:ligatures w14:val="standardContextual"/>
         </w:rPr>
       </w:pPr>
-      <w:hyperlink w:anchor="_Toc241671808" w:history="1">
+      <w:hyperlink w:anchor="_Toc242116428" w:history="1">
         <w:r>
           <w:rPr>
             <w:rStyle w:val="Hyperlink"/>
@@ -2586,7 +2628,7 @@
             <w:noProof/>
             <w:webHidden/>
           </w:rPr>
-          <w:instrText xml:space="preserve"> PAGEREF _Toc241671808 \h </w:instrText>
+          <w:instrText xml:space="preserve"> PAGEREF _Toc242116428 \h </w:instrText>
         </w:r>
         <w:r>
           <w:rPr>
@@ -2632,7 +2674,7 @@
           <w14:ligatures w14:val="standardContextual"/>
         </w:rPr>
       </w:pPr>
-      <w:hyperlink w:anchor="_Toc241671809" w:history="1">
+      <w:hyperlink w:anchor="_Toc242116429" w:history="1">
         <w:r>
           <w:rPr>
             <w:rStyle w:val="Hyperlink"/>
@@ -2660,7 +2702,7 @@
             <w:noProof/>
             <w:webHidden/>
           </w:rPr>
-          <w:instrText xml:space="preserve"> PAGEREF _Toc241671809 \h </w:instrText>
+          <w:instrText xml:space="preserve"> PAGEREF _Toc242116429 \h </w:instrText>
         </w:r>
         <w:r>
           <w:rPr>
@@ -2706,7 +2748,7 @@
           <w14:ligatures w14:val="standardContextual"/>
         </w:rPr>
       </w:pPr>
-      <w:hyperlink w:anchor="_Toc241671810" w:history="1">
+      <w:hyperlink w:anchor="_Toc242116430" w:history="1">
         <w:r>
           <w:rPr>
             <w:rStyle w:val="Hyperlink"/>
@@ -2734,7 +2776,7 @@
             <w:noProof/>
             <w:webHidden/>
           </w:rPr>
-          <w:instrText xml:space="preserve"> PAGEREF _Toc241671810 \h </w:instrText>
+          <w:instrText xml:space="preserve"> PAGEREF _Toc242116430 \h </w:instrText>
         </w:r>
         <w:r>
           <w:rPr>
@@ -2780,7 +2822,7 @@
           <w14:ligatures w14:val="standardContextual"/>
         </w:rPr>
       </w:pPr>
-      <w:hyperlink w:anchor="_Toc241671811" w:history="1">
+      <w:hyperlink w:anchor="_Toc242116431" w:history="1">
         <w:r>
           <w:rPr>
             <w:rStyle w:val="Hyperlink"/>
@@ -2808,7 +2850,7 @@
             <w:noProof/>
             <w:webHidden/>
           </w:rPr>
-          <w:instrText xml:space="preserve"> PAGEREF _Toc241671811 \h </w:instrText>
+          <w:instrText xml:space="preserve"> PAGEREF _Toc242116431 \h </w:instrText>
         </w:r>
         <w:r>
           <w:rPr>
@@ -2854,7 +2896,7 @@
           <w14:ligatures w14:val="standardContextual"/>
         </w:rPr>
       </w:pPr>
-      <w:hyperlink w:anchor="_Toc241671812" w:history="1">
+      <w:hyperlink w:anchor="_Toc242116432" w:history="1">
         <w:r>
           <w:rPr>
             <w:rStyle w:val="Hyperlink"/>
@@ -2882,7 +2924,7 @@
             <w:noProof/>
             <w:webHidden/>
           </w:rPr>
-          <w:instrText xml:space="preserve"> PAGEREF _Toc241671812 \h </w:instrText>
+          <w:instrText xml:space="preserve"> PAGEREF _Toc242116432 \h </w:instrText>
         </w:r>
         <w:r>
           <w:rPr>
@@ -2928,7 +2970,7 @@
           <w14:ligatures w14:val="standardContextual"/>
         </w:rPr>
       </w:pPr>
-      <w:hyperlink w:anchor="_Toc241671813" w:history="1">
+      <w:hyperlink w:anchor="_Toc242116433" w:history="1">
         <w:r>
           <w:rPr>
             <w:rStyle w:val="Hyperlink"/>
@@ -2956,7 +2998,7 @@
             <w:noProof/>
             <w:webHidden/>
           </w:rPr>
-          <w:instrText xml:space="preserve"> PAGEREF _Toc241671813 \h </w:instrText>
+          <w:instrText xml:space="preserve"> PAGEREF _Toc242116433 \h </w:instrText>
         </w:r>
         <w:r>
           <w:rPr>
@@ -3002,7 +3044,7 @@
           <w14:ligatures w14:val="standardContextual"/>
         </w:rPr>
       </w:pPr>
-      <w:hyperlink w:anchor="_Toc241671814" w:history="1">
+      <w:hyperlink w:anchor="_Toc242116434" w:history="1">
         <w:r>
           <w:rPr>
             <w:rStyle w:val="Hyperlink"/>
@@ -3030,7 +3072,7 @@
             <w:noProof/>
             <w:webHidden/>
           </w:rPr>
-          <w:instrText xml:space="preserve"> PAGEREF _Toc241671814 \h </w:instrText>
+          <w:instrText xml:space="preserve"> PAGEREF _Toc242116434 \h </w:instrText>
         </w:r>
         <w:r>
           <w:rPr>
@@ -3076,7 +3118,7 @@
           <w14:ligatures w14:val="standardContextual"/>
         </w:rPr>
       </w:pPr>
-      <w:hyperlink w:anchor="_Toc241671815" w:history="1">
+      <w:hyperlink w:anchor="_Toc242116435" w:history="1">
         <w:r>
           <w:rPr>
             <w:rStyle w:val="Hyperlink"/>
@@ -3104,7 +3146,7 @@
             <w:noProof/>
             <w:webHidden/>
           </w:rPr>
-          <w:instrText xml:space="preserve"> PAGEREF _Toc241671815 \h </w:instrText>
+          <w:instrText xml:space="preserve"> PAGEREF _Toc242116435 \h </w:instrText>
         </w:r>
         <w:r>
           <w:rPr>
@@ -3150,7 +3192,7 @@
           <w14:ligatures w14:val="standardContextual"/>
         </w:rPr>
       </w:pPr>
-      <w:hyperlink w:anchor="_Toc241671816" w:history="1">
+      <w:hyperlink w:anchor="_Toc242116436" w:history="1">
         <w:r>
           <w:rPr>
             <w:rStyle w:val="Hyperlink"/>
@@ -3178,7 +3220,7 @@
             <w:noProof/>
             <w:webHidden/>
           </w:rPr>
-          <w:instrText xml:space="preserve"> PAGEREF _Toc241671816 \h </w:instrText>
+          <w:instrText xml:space="preserve"> PAGEREF _Toc242116436 \h </w:instrText>
         </w:r>
         <w:r>
           <w:rPr>
@@ -3224,7 +3266,7 @@
           <w14:ligatures w14:val="standardContextual"/>
         </w:rPr>
       </w:pPr>
-      <w:hyperlink w:anchor="_Toc241671817" w:history="1">
+      <w:hyperlink w:anchor="_Toc242116437" w:history="1">
         <w:r>
           <w:rPr>
             <w:rStyle w:val="Hyperlink"/>
@@ -3252,7 +3294,7 @@
             <w:noProof/>
             <w:webHidden/>
           </w:rPr>
-          <w:instrText xml:space="preserve"> PAGEREF _Toc241671817 \h </w:instrText>
+          <w:instrText xml:space="preserve"> PAGEREF _Toc242116437 \h </w:instrText>
         </w:r>
         <w:r>
           <w:rPr>
@@ -3298,7 +3340,7 @@
           <w14:ligatures w14:val="standardContextual"/>
         </w:rPr>
       </w:pPr>
-      <w:hyperlink w:anchor="_Toc241671818" w:history="1">
+      <w:hyperlink w:anchor="_Toc242116438" w:history="1">
         <w:r>
           <w:rPr>
             <w:rStyle w:val="Hyperlink"/>
@@ -3326,7 +3368,7 @@
             <w:noProof/>
             <w:webHidden/>
           </w:rPr>
-          <w:instrText xml:space="preserve"> PAGEREF _Toc241671818 \h </w:instrText>
+          <w:instrText xml:space="preserve"> PAGEREF _Toc242116438 \h </w:instrText>
         </w:r>
         <w:r>
           <w:rPr>
@@ -3372,7 +3414,7 @@
           <w14:ligatures w14:val="standardContextual"/>
         </w:rPr>
       </w:pPr>
-      <w:hyperlink w:anchor="_Toc241671819" w:history="1">
+      <w:hyperlink w:anchor="_Toc242116439" w:history="1">
         <w:r>
           <w:rPr>
             <w:rStyle w:val="Hyperlink"/>
@@ -3400,7 +3442,7 @@
             <w:noProof/>
             <w:webHidden/>
           </w:rPr>
-          <w:instrText xml:space="preserve"> PAGEREF _Toc241671819 \h </w:instrText>
+          <w:instrText xml:space="preserve"> PAGEREF _Toc242116439 \h </w:instrText>
         </w:r>
         <w:r>
           <w:rPr>
@@ -3446,7 +3488,7 @@
           <w14:ligatures w14:val="standardContextual"/>
         </w:rPr>
       </w:pPr>
-      <w:hyperlink w:anchor="_Toc241671820" w:history="1">
+      <w:hyperlink w:anchor="_Toc242116440" w:history="1">
         <w:r>
           <w:rPr>
             <w:rStyle w:val="Hyperlink"/>
@@ -3474,7 +3516,7 @@
             <w:noProof/>
             <w:webHidden/>
           </w:rPr>
-          <w:instrText xml:space="preserve"> PAGEREF _Toc241671820 \h </w:instrText>
+          <w:instrText xml:space="preserve"> PAGEREF _Toc242116440 \h </w:instrText>
         </w:r>
         <w:r>
           <w:rPr>
@@ -3520,7 +3562,7 @@
           <w14:ligatures w14:val="standardContextual"/>
         </w:rPr>
       </w:pPr>
-      <w:hyperlink w:anchor="_Toc241671821" w:history="1">
+      <w:hyperlink w:anchor="_Toc242116441" w:history="1">
         <w:r>
           <w:rPr>
             <w:rStyle w:val="Hyperlink"/>
@@ -3548,7 +3590,7 @@
             <w:noProof/>
             <w:webHidden/>
           </w:rPr>
-          <w:instrText xml:space="preserve"> PAGEREF _Toc241671821 \h </w:instrText>
+          <w:instrText xml:space="preserve"> PAGEREF _Toc242116441 \h </w:instrText>
         </w:r>
         <w:r>
           <w:rPr>
@@ -3594,7 +3636,7 @@
           <w14:ligatures w14:val="standardContextual"/>
         </w:rPr>
       </w:pPr>
-      <w:hyperlink w:anchor="_Toc241671822" w:history="1">
+      <w:hyperlink w:anchor="_Toc242116442" w:history="1">
         <w:r>
           <w:rPr>
             <w:rStyle w:val="Hyperlink"/>
@@ -3622,7 +3664,7 @@
             <w:noProof/>
             <w:webHidden/>
           </w:rPr>
-          <w:instrText xml:space="preserve"> PAGEREF _Toc241671822 \h </w:instrText>
+          <w:instrText xml:space="preserve"> PAGEREF _Toc242116442 \h </w:instrText>
         </w:r>
         <w:r>
           <w:rPr>
@@ -3668,7 +3710,7 @@
           <w14:ligatures w14:val="standardContextual"/>
         </w:rPr>
       </w:pPr>
-      <w:hyperlink w:anchor="_Toc241671823" w:history="1">
+      <w:hyperlink w:anchor="_Toc242116443" w:history="1">
         <w:r>
           <w:rPr>
             <w:rStyle w:val="Hyperlink"/>
@@ -3696,7 +3738,7 @@
             <w:noProof/>
             <w:webHidden/>
           </w:rPr>
-          <w:instrText xml:space="preserve"> PAGEREF _Toc241671823 \h </w:instrText>
+          <w:instrText xml:space="preserve"> PAGEREF _Toc242116443 \h </w:instrText>
         </w:r>
         <w:r>
           <w:rPr>
@@ -3742,7 +3784,7 @@
           <w14:ligatures w14:val="standardContextual"/>
         </w:rPr>
       </w:pPr>
-      <w:hyperlink w:anchor="_Toc241671824" w:history="1">
+      <w:hyperlink w:anchor="_Toc242116444" w:history="1">
         <w:r>
           <w:rPr>
             <w:rStyle w:val="Hyperlink"/>
@@ -3770,7 +3812,7 @@
             <w:noProof/>
             <w:webHidden/>
           </w:rPr>
-          <w:instrText xml:space="preserve"> PAGEREF _Toc241671824 \h </w:instrText>
+          <w:instrText xml:space="preserve"> PAGEREF _Toc242116444 \h </w:instrText>
         </w:r>
         <w:r>
           <w:rPr>
@@ -3816,7 +3858,7 @@
           <w14:ligatures w14:val="standardContextual"/>
         </w:rPr>
       </w:pPr>
-      <w:hyperlink w:anchor="_Toc241671825" w:history="1">
+      <w:hyperlink w:anchor="_Toc242116445" w:history="1">
         <w:r>
           <w:rPr>
             <w:rStyle w:val="Hyperlink"/>
@@ -3844,7 +3886,7 @@
             <w:noProof/>
             <w:webHidden/>
           </w:rPr>
-          <w:instrText xml:space="preserve"> PAGEREF _Toc241671825 \h </w:instrText>
+          <w:instrText xml:space="preserve"> PAGEREF _Toc242116445 \h </w:instrText>
         </w:r>
         <w:r>
           <w:rPr>
@@ -3890,7 +3932,7 @@
           <w14:ligatures w14:val="standardContextual"/>
         </w:rPr>
       </w:pPr>
-      <w:hyperlink w:anchor="_Toc241671826" w:history="1">
+      <w:hyperlink w:anchor="_Toc242116446" w:history="1">
         <w:r>
           <w:rPr>
             <w:rStyle w:val="Hyperlink"/>
@@ -3918,7 +3960,7 @@
             <w:noProof/>
             <w:webHidden/>
           </w:rPr>
-          <w:instrText xml:space="preserve"> PAGEREF _Toc241671826 \h </w:instrText>
+          <w:instrText xml:space="preserve"> PAGEREF _Toc242116446 \h </w:instrText>
         </w:r>
         <w:r>
           <w:rPr>
@@ -3964,7 +4006,7 @@
           <w14:ligatures w14:val="standardContextual"/>
         </w:rPr>
       </w:pPr>
-      <w:hyperlink w:anchor="_Toc241671827" w:history="1">
+      <w:hyperlink w:anchor="_Toc242116447" w:history="1">
         <w:r>
           <w:rPr>
             <w:rStyle w:val="Hyperlink"/>
@@ -3992,7 +4034,7 @@
             <w:noProof/>
             <w:webHidden/>
           </w:rPr>
-          <w:instrText xml:space="preserve"> PAGEREF _Toc241671827 \h </w:instrText>
+          <w:instrText xml:space="preserve"> PAGEREF _Toc242116447 \h </w:instrText>
         </w:r>
         <w:r>
           <w:rPr>
@@ -4038,7 +4080,7 @@
           <w14:ligatures w14:val="standardContextual"/>
         </w:rPr>
       </w:pPr>
-      <w:hyperlink w:anchor="_Toc241671828" w:history="1">
+      <w:hyperlink w:anchor="_Toc242116448" w:history="1">
         <w:r>
           <w:rPr>
             <w:rStyle w:val="Hyperlink"/>
@@ -4066,7 +4108,7 @@
             <w:noProof/>
             <w:webHidden/>
           </w:rPr>
-          <w:instrText xml:space="preserve"> PAGEREF _Toc241671828 \h </w:instrText>
+          <w:instrText xml:space="preserve"> PAGEREF _Toc242116448 \h </w:instrText>
         </w:r>
         <w:r>
           <w:rPr>
@@ -4112,7 +4154,7 @@
           <w14:ligatures w14:val="standardContextual"/>
         </w:rPr>
       </w:pPr>
-      <w:hyperlink w:anchor="_Toc241671829" w:history="1">
+      <w:hyperlink w:anchor="_Toc242116449" w:history="1">
         <w:r>
           <w:rPr>
             <w:rStyle w:val="Hyperlink"/>
@@ -4140,7 +4182,7 @@
             <w:noProof/>
             <w:webHidden/>
           </w:rPr>
-          <w:instrText xml:space="preserve"> PAGEREF _Toc241671829 \h </w:instrText>
+          <w:instrText xml:space="preserve"> PAGEREF _Toc242116449 \h </w:instrText>
         </w:r>
         <w:r>
           <w:rPr>
@@ -4186,7 +4228,7 @@
           <w14:ligatures w14:val="standardContextual"/>
         </w:rPr>
       </w:pPr>
-      <w:hyperlink w:anchor="_Toc241671830" w:history="1">
+      <w:hyperlink w:anchor="_Toc242116450" w:history="1">
         <w:r>
           <w:rPr>
             <w:rStyle w:val="Hyperlink"/>
@@ -4214,7 +4256,7 @@
             <w:noProof/>
             <w:webHidden/>
           </w:rPr>
-          <w:instrText xml:space="preserve"> PAGEREF _Toc241671830 \h </w:instrText>
+          <w:instrText xml:space="preserve"> PAGEREF _Toc242116450 \h </w:instrText>
         </w:r>
         <w:r>
           <w:rPr>
@@ -4260,7 +4302,7 @@
           <w14:ligatures w14:val="standardContextual"/>
         </w:rPr>
       </w:pPr>
-      <w:hyperlink w:anchor="_Toc241671831" w:history="1">
+      <w:hyperlink w:anchor="_Toc242116451" w:history="1">
         <w:r>
           <w:rPr>
             <w:rStyle w:val="Hyperlink"/>
@@ -4288,7 +4330,7 @@
             <w:noProof/>
             <w:webHidden/>
           </w:rPr>
-          <w:instrText xml:space="preserve"> PAGEREF _Toc241671831 \h </w:instrText>
+          <w:instrText xml:space="preserve"> PAGEREF _Toc242116451 \h </w:instrText>
         </w:r>
         <w:r>
           <w:rPr>
@@ -6169,7 +6211,7 @@
       <w:pPr>
         <w:pStyle w:val="Heading1"/>
       </w:pPr>
-      <w:bookmarkStart w:id="0" w:name="_Toc241671782"/>
+      <w:bookmarkStart w:id="0" w:name="_Toc242116402"/>
       <w:r>
         <w:lastRenderedPageBreak/>
         <w:t>1. Introduction</w:t>
@@ -6180,7 +6222,7 @@
       <w:pPr>
         <w:pStyle w:val="Heading2"/>
       </w:pPr>
-      <w:bookmarkStart w:id="1" w:name="_Toc241671783"/>
+      <w:bookmarkStart w:id="1" w:name="_Toc242116403"/>
       <w:r>
         <w:t>1.1 Introduction to the Internship</w:t>
       </w:r>
@@ -6195,7 +6237,7 @@
       <w:pPr>
         <w:pStyle w:val="Heading2"/>
       </w:pPr>
-      <w:bookmarkStart w:id="2" w:name="_Toc241671784"/>
+      <w:bookmarkStart w:id="2" w:name="_Toc242116404"/>
       <w:r>
         <w:t>1.2 Project Background</w:t>
       </w:r>
@@ -6210,7 +6252,7 @@
       <w:pPr>
         <w:pStyle w:val="Heading2"/>
       </w:pPr>
-      <w:bookmarkStart w:id="3" w:name="_Toc241671785"/>
+      <w:bookmarkStart w:id="3" w:name="_Toc242116405"/>
       <w:r>
         <w:t>1.3 Objectives and Scope</w:t>
       </w:r>
@@ -6262,7 +6304,7 @@
       <w:pPr>
         <w:pStyle w:val="Heading1"/>
       </w:pPr>
-      <w:bookmarkStart w:id="4" w:name="_Toc241671786"/>
+      <w:bookmarkStart w:id="4" w:name="_Toc242116406"/>
       <w:r>
         <w:lastRenderedPageBreak/>
         <w:t>2. Organization Profile</w:t>
@@ -6273,7 +6315,7 @@
       <w:pPr>
         <w:pStyle w:val="Heading2"/>
       </w:pPr>
-      <w:bookmarkStart w:id="5" w:name="_Toc241671787"/>
+      <w:bookmarkStart w:id="5" w:name="_Toc242116407"/>
       <w:r>
         <w:t>2.1 Internship Program</w:t>
       </w:r>
@@ -6288,7 +6330,7 @@
       <w:pPr>
         <w:pStyle w:val="Heading2"/>
       </w:pPr>
-      <w:bookmarkStart w:id="6" w:name="_Toc241671788"/>
+      <w:bookmarkStart w:id="6" w:name="_Toc242116408"/>
       <w:r>
         <w:t>2.2 Academic Setting</w:t>
       </w:r>
@@ -6303,7 +6345,7 @@
       <w:pPr>
         <w:pStyle w:val="Heading2"/>
       </w:pPr>
-      <w:bookmarkStart w:id="7" w:name="_Toc241671789"/>
+      <w:bookmarkStart w:id="7" w:name="_Toc242116409"/>
       <w:r>
         <w:t>2.3 Relevance of the Program</w:t>
       </w:r>
@@ -6323,7 +6365,7 @@
       <w:pPr>
         <w:pStyle w:val="Heading1"/>
       </w:pPr>
-      <w:bookmarkStart w:id="8" w:name="_Toc241671790"/>
+      <w:bookmarkStart w:id="8" w:name="_Toc242116410"/>
       <w:r>
         <w:lastRenderedPageBreak/>
         <w:t>3. Internship Objectives and Activities</w:t>
@@ -6334,7 +6376,7 @@
       <w:pPr>
         <w:pStyle w:val="Heading2"/>
       </w:pPr>
-      <w:bookmarkStart w:id="9" w:name="_Toc241671791"/>
+      <w:bookmarkStart w:id="9" w:name="_Toc242116411"/>
       <w:r>
         <w:t>3.1 Technical Objectives</w:t>
       </w:r>
@@ -6349,7 +6391,7 @@
       <w:pPr>
         <w:pStyle w:val="Heading2"/>
       </w:pPr>
-      <w:bookmarkStart w:id="10" w:name="_Toc241671792"/>
+      <w:bookmarkStart w:id="10" w:name="_Toc242116412"/>
       <w:r>
         <w:t>3.2 Activities Reflected in the Project</w:t>
       </w:r>
@@ -6407,7 +6449,7 @@
       <w:pPr>
         <w:pStyle w:val="Heading2"/>
       </w:pPr>
-      <w:bookmarkStart w:id="11" w:name="_Toc241671793"/>
+      <w:bookmarkStart w:id="11" w:name="_Toc242116413"/>
       <w:r>
         <w:t>3.3 Deliverables</w:t>
       </w:r>
@@ -6427,7 +6469,7 @@
       <w:pPr>
         <w:pStyle w:val="Heading1"/>
       </w:pPr>
-      <w:bookmarkStart w:id="12" w:name="_Toc241671794"/>
+      <w:bookmarkStart w:id="12" w:name="_Toc242116414"/>
       <w:r>
         <w:lastRenderedPageBreak/>
         <w:t>4. Problem Statement</w:t>
@@ -6438,7 +6480,7 @@
       <w:pPr>
         <w:pStyle w:val="Heading2"/>
       </w:pPr>
-      <w:bookmarkStart w:id="13" w:name="_Toc241671795"/>
+      <w:bookmarkStart w:id="13" w:name="_Toc242116415"/>
       <w:r>
         <w:t>4.1 Existing Approach</w:t>
       </w:r>
@@ -6453,7 +6495,7 @@
       <w:pPr>
         <w:pStyle w:val="Heading2"/>
       </w:pPr>
-      <w:bookmarkStart w:id="14" w:name="_Toc241671796"/>
+      <w:bookmarkStart w:id="14" w:name="_Toc242116416"/>
       <w:r>
         <w:t>4.2 Proposed System</w:t>
       </w:r>
@@ -6468,7 +6510,7 @@
       <w:pPr>
         <w:pStyle w:val="Heading2"/>
       </w:pPr>
-      <w:bookmarkStart w:id="15" w:name="_Toc241671797"/>
+      <w:bookmarkStart w:id="15" w:name="_Toc242116417"/>
       <w:r>
         <w:t>4.3 Boundaries</w:t>
       </w:r>
@@ -6488,7 +6530,7 @@
       <w:pPr>
         <w:pStyle w:val="Heading1"/>
       </w:pPr>
-      <w:bookmarkStart w:id="16" w:name="_Toc241671798"/>
+      <w:bookmarkStart w:id="16" w:name="_Toc242116418"/>
       <w:r>
         <w:lastRenderedPageBreak/>
         <w:t>5. Technologies and Tools Used</w:t>
@@ -7028,7 +7070,7 @@
       <w:pPr>
         <w:pStyle w:val="Heading1"/>
       </w:pPr>
-      <w:bookmarkStart w:id="18" w:name="_Toc241671799"/>
+      <w:bookmarkStart w:id="18" w:name="_Toc242116419"/>
       <w:r>
         <w:lastRenderedPageBreak/>
         <w:t>6. System Analysis</w:t>
@@ -7039,7 +7081,7 @@
       <w:pPr>
         <w:pStyle w:val="Heading2"/>
       </w:pPr>
-      <w:bookmarkStart w:id="19" w:name="_Toc241671800"/>
+      <w:bookmarkStart w:id="19" w:name="_Toc242116420"/>
       <w:r>
         <w:t>6.1 Functional Requirements</w:t>
       </w:r>
@@ -7448,7 +7490,7 @@
       <w:pPr>
         <w:pStyle w:val="Heading2"/>
       </w:pPr>
-      <w:bookmarkStart w:id="21" w:name="_Toc241671801"/>
+      <w:bookmarkStart w:id="21" w:name="_Toc242116421"/>
       <w:r>
         <w:t>6.2 Nonfunctional Requirements</w:t>
       </w:r>
@@ -7463,7 +7505,7 @@
       <w:pPr>
         <w:pStyle w:val="Heading2"/>
       </w:pPr>
-      <w:bookmarkStart w:id="22" w:name="_Toc241671802"/>
+      <w:bookmarkStart w:id="22" w:name="_Toc242116422"/>
       <w:r>
         <w:t>6.3 Hardware and Software</w:t>
       </w:r>
@@ -7483,7 +7525,7 @@
       <w:pPr>
         <w:pStyle w:val="Heading1"/>
       </w:pPr>
-      <w:bookmarkStart w:id="23" w:name="_Toc241671803"/>
+      <w:bookmarkStart w:id="23" w:name="_Toc242116423"/>
       <w:r>
         <w:lastRenderedPageBreak/>
         <w:t>7. System Design</w:t>
@@ -7494,7 +7536,7 @@
       <w:pPr>
         <w:pStyle w:val="Heading2"/>
       </w:pPr>
-      <w:bookmarkStart w:id="24" w:name="_Toc241671804"/>
+      <w:bookmarkStart w:id="24" w:name="_Toc242116424"/>
       <w:r>
         <w:t>7.1 Data Flow Diagram</w:t>
       </w:r>
@@ -7531,7 +7573,7 @@
           <w:noProof/>
         </w:rPr>
         <w:drawing>
-          <wp:inline distT="0" distB="0" distL="0" distR="0" wp14:anchorId="073E88B8" wp14:editId="050FB54B">
+          <wp:inline distT="0" distB="0" distL="0" distR="0" wp14:anchorId="76432447" wp14:editId="08D3BAC5">
             <wp:extent cx="5440680" cy="3173730"/>
             <wp:effectExtent l="0" t="0" r="0" b="0"/>
             <wp:docPr id="4" name="Picture 4"/>
@@ -7604,7 +7646,7 @@
           <w:noProof/>
         </w:rPr>
         <w:drawing>
-          <wp:inline distT="0" distB="0" distL="0" distR="0" wp14:anchorId="46AAB0EF" wp14:editId="1D52A93D">
+          <wp:inline distT="0" distB="0" distL="0" distR="0" wp14:anchorId="3DB0DE86" wp14:editId="4555950B">
             <wp:extent cx="5440680" cy="3173730"/>
             <wp:effectExtent l="0" t="0" r="0" b="0"/>
             <wp:docPr id="5" name="Picture 5"/>
@@ -7654,7 +7696,7 @@
       <w:pPr>
         <w:pStyle w:val="Heading2"/>
       </w:pPr>
-      <w:bookmarkStart w:id="27" w:name="_Toc241671805"/>
+      <w:bookmarkStart w:id="27" w:name="_Toc242116425"/>
       <w:r>
         <w:lastRenderedPageBreak/>
         <w:t>7.2 Entity Relationship Diagram</w:t>
@@ -7692,7 +7734,7 @@
           <w:noProof/>
         </w:rPr>
         <w:drawing>
-          <wp:inline distT="0" distB="0" distL="0" distR="0" wp14:anchorId="0733543E" wp14:editId="57338226">
+          <wp:inline distT="0" distB="0" distL="0" distR="0" wp14:anchorId="7F43A314" wp14:editId="60D43F88">
             <wp:extent cx="5440680" cy="3173730"/>
             <wp:effectExtent l="0" t="0" r="0" b="0"/>
             <wp:docPr id="6" name="Picture 6"/>
@@ -7742,7 +7784,7 @@
       <w:pPr>
         <w:pStyle w:val="Heading1"/>
       </w:pPr>
-      <w:bookmarkStart w:id="29" w:name="_Toc241671806"/>
+      <w:bookmarkStart w:id="29" w:name="_Toc242116426"/>
       <w:r>
         <w:lastRenderedPageBreak/>
         <w:t>8. Implementation</w:t>
@@ -7753,7 +7795,7 @@
       <w:pPr>
         <w:pStyle w:val="Heading2"/>
       </w:pPr>
-      <w:bookmarkStart w:id="30" w:name="_Toc241671807"/>
+      <w:bookmarkStart w:id="30" w:name="_Toc242116427"/>
       <w:r>
         <w:t>8.1 Modules</w:t>
       </w:r>
@@ -8102,7 +8144,7 @@
       <w:pPr>
         <w:pStyle w:val="Heading2"/>
       </w:pPr>
-      <w:bookmarkStart w:id="32" w:name="_Toc241671808"/>
+      <w:bookmarkStart w:id="32" w:name="_Toc242116428"/>
       <w:r>
         <w:t>8.2 Data Preparation</w:t>
       </w:r>
@@ -8117,7 +8159,7 @@
       <w:pPr>
         <w:pStyle w:val="Heading2"/>
       </w:pPr>
-      <w:bookmarkStart w:id="33" w:name="_Toc241671809"/>
+      <w:bookmarkStart w:id="33" w:name="_Toc242116429"/>
       <w:r>
         <w:t>8.3 Feature Extraction and Training</w:t>
       </w:r>
@@ -8132,7 +8174,7 @@
       <w:pPr>
         <w:pStyle w:val="Heading2"/>
       </w:pPr>
-      <w:bookmarkStart w:id="34" w:name="_Toc241671810"/>
+      <w:bookmarkStart w:id="34" w:name="_Toc242116430"/>
       <w:r>
         <w:t>8.4 Selection and Serialization</w:t>
       </w:r>
@@ -8147,7 +8189,7 @@
       <w:pPr>
         <w:pStyle w:val="Heading2"/>
       </w:pPr>
-      <w:bookmarkStart w:id="35" w:name="_Toc241671811"/>
+      <w:bookmarkStart w:id="35" w:name="_Toc242116431"/>
       <w:r>
         <w:lastRenderedPageBreak/>
         <w:t>8.5 Streamlit Application</w:t>
@@ -8185,7 +8227,7 @@
           <w:noProof/>
         </w:rPr>
         <w:drawing>
-          <wp:inline distT="0" distB="0" distL="0" distR="0" wp14:anchorId="6E14CB69" wp14:editId="2ECC72A8">
+          <wp:inline distT="0" distB="0" distL="0" distR="0" wp14:anchorId="49963B9E" wp14:editId="2379F5DD">
             <wp:extent cx="5120640" cy="5334000"/>
             <wp:effectExtent l="0" t="0" r="0" b="0"/>
             <wp:docPr id="7" name="Picture 7"/>
@@ -8235,7 +8277,7 @@
       <w:pPr>
         <w:pStyle w:val="Heading1"/>
       </w:pPr>
-      <w:bookmarkStart w:id="37" w:name="_Toc241671812"/>
+      <w:bookmarkStart w:id="37" w:name="_Toc242116432"/>
       <w:r>
         <w:lastRenderedPageBreak/>
         <w:t>9. Testing</w:t>
@@ -8246,7 +8288,7 @@
       <w:pPr>
         <w:pStyle w:val="Heading2"/>
       </w:pPr>
-      <w:bookmarkStart w:id="38" w:name="_Toc241671813"/>
+      <w:bookmarkStart w:id="38" w:name="_Toc242116433"/>
       <w:r>
         <w:t>9.1 Test Strategy</w:t>
       </w:r>
@@ -8261,7 +8303,7 @@
       <w:pPr>
         <w:pStyle w:val="Heading2"/>
       </w:pPr>
-      <w:bookmarkStart w:id="39" w:name="_Toc241671814"/>
+      <w:bookmarkStart w:id="39" w:name="_Toc242116434"/>
       <w:r>
         <w:t>9.2 Functional Checks</w:t>
       </w:r>
@@ -8837,7 +8879,7 @@
       <w:pPr>
         <w:pStyle w:val="Heading2"/>
       </w:pPr>
-      <w:bookmarkStart w:id="41" w:name="_Toc241671815"/>
+      <w:bookmarkStart w:id="41" w:name="_Toc242116435"/>
       <w:r>
         <w:t>9.3 Interpretation</w:t>
       </w:r>
@@ -8857,7 +8899,7 @@
       <w:pPr>
         <w:pStyle w:val="Heading1"/>
       </w:pPr>
-      <w:bookmarkStart w:id="42" w:name="_Toc241671816"/>
+      <w:bookmarkStart w:id="42" w:name="_Toc242116436"/>
       <w:r>
         <w:lastRenderedPageBreak/>
         <w:t>10. Results and Discussion</w:t>
@@ -8868,7 +8910,7 @@
       <w:pPr>
         <w:pStyle w:val="Heading2"/>
       </w:pPr>
-      <w:bookmarkStart w:id="43" w:name="_Toc241671817"/>
+      <w:bookmarkStart w:id="43" w:name="_Toc242116437"/>
       <w:r>
         <w:t>10.1 Dataset and Experiment</w:t>
       </w:r>
@@ -8905,7 +8947,7 @@
           <w:noProof/>
         </w:rPr>
         <w:drawing>
-          <wp:inline distT="0" distB="0" distL="0" distR="0" wp14:anchorId="74576614" wp14:editId="57F3FF4E">
+          <wp:inline distT="0" distB="0" distL="0" distR="0" wp14:anchorId="18D9F47B" wp14:editId="7C84DA50">
             <wp:extent cx="5440680" cy="3587195"/>
             <wp:effectExtent l="0" t="0" r="0" b="0"/>
             <wp:docPr id="8" name="Picture 8"/>
@@ -8955,7 +8997,7 @@
       <w:pPr>
         <w:pStyle w:val="Heading2"/>
       </w:pPr>
-      <w:bookmarkStart w:id="45" w:name="_Toc241671818"/>
+      <w:bookmarkStart w:id="45" w:name="_Toc242116438"/>
       <w:r>
         <w:lastRenderedPageBreak/>
         <w:t>10.2 Model Comparison</w:t>
@@ -10234,7 +10276,7 @@
           <w:noProof/>
         </w:rPr>
         <w:drawing>
-          <wp:inline distT="0" distB="0" distL="0" distR="0" wp14:anchorId="46963EDC" wp14:editId="0CF64A81">
+          <wp:inline distT="0" distB="0" distL="0" distR="0" wp14:anchorId="0FB821C8" wp14:editId="25F4ACBB">
             <wp:extent cx="5440680" cy="2691221"/>
             <wp:effectExtent l="0" t="0" r="0" b="0"/>
             <wp:docPr id="9" name="Picture 9"/>
@@ -10307,7 +10349,7 @@
           <w:noProof/>
         </w:rPr>
         <w:drawing>
-          <wp:inline distT="0" distB="0" distL="0" distR="0" wp14:anchorId="5F94DC67" wp14:editId="6CD83554">
+          <wp:inline distT="0" distB="0" distL="0" distR="0" wp14:anchorId="369348D1" wp14:editId="4B5D4D52">
             <wp:extent cx="4937760" cy="3493736"/>
             <wp:effectExtent l="0" t="0" r="0" b="0"/>
             <wp:docPr id="10" name="Picture 10"/>
@@ -10357,7 +10399,7 @@
       <w:pPr>
         <w:pStyle w:val="Heading2"/>
       </w:pPr>
-      <w:bookmarkStart w:id="49" w:name="_Toc241671819"/>
+      <w:bookmarkStart w:id="49" w:name="_Toc242116439"/>
       <w:r>
         <w:lastRenderedPageBreak/>
         <w:t>10.3 Application Output</w:t>
@@ -10395,7 +10437,7 @@
           <w:noProof/>
         </w:rPr>
         <w:drawing>
-          <wp:inline distT="0" distB="0" distL="0" distR="0" wp14:anchorId="3D82D685" wp14:editId="5F6C81A8">
+          <wp:inline distT="0" distB="0" distL="0" distR="0" wp14:anchorId="556C22FF" wp14:editId="3087732B">
             <wp:extent cx="5029200" cy="5238750"/>
             <wp:effectExtent l="0" t="0" r="0" b="0"/>
             <wp:docPr id="11" name="Picture 11"/>
@@ -10838,7 +10880,7 @@
       <w:pPr>
         <w:pStyle w:val="Heading2"/>
       </w:pPr>
-      <w:bookmarkStart w:id="52" w:name="_Toc241671820"/>
+      <w:bookmarkStart w:id="52" w:name="_Toc242116440"/>
       <w:r>
         <w:t>10.4 Limitations</w:t>
       </w:r>
@@ -10863,7 +10905,7 @@
       <w:pPr>
         <w:pStyle w:val="Heading1"/>
       </w:pPr>
-      <w:bookmarkStart w:id="53" w:name="_Toc241671821"/>
+      <w:bookmarkStart w:id="53" w:name="_Toc242116441"/>
       <w:r>
         <w:lastRenderedPageBreak/>
         <w:t>11. Learning Outcomes</w:t>
@@ -10889,7 +10931,7 @@
       <w:pPr>
         <w:pStyle w:val="Heading1"/>
       </w:pPr>
-      <w:bookmarkStart w:id="54" w:name="_Toc241671822"/>
+      <w:bookmarkStart w:id="54" w:name="_Toc242116442"/>
       <w:r>
         <w:lastRenderedPageBreak/>
         <w:t>12. Challenges and Solutions</w:t>
@@ -10900,7 +10942,7 @@
       <w:pPr>
         <w:pStyle w:val="Heading2"/>
       </w:pPr>
-      <w:bookmarkStart w:id="55" w:name="_Toc241671823"/>
+      <w:bookmarkStart w:id="55" w:name="_Toc242116443"/>
       <w:r>
         <w:t>12.1 Class Imbalance</w:t>
       </w:r>
@@ -10915,7 +10957,7 @@
       <w:pPr>
         <w:pStyle w:val="Heading2"/>
       </w:pPr>
-      <w:bookmarkStart w:id="56" w:name="_Toc241671824"/>
+      <w:bookmarkStart w:id="56" w:name="_Toc242116444"/>
       <w:r>
         <w:t>12.2 Training and Inference Consistency</w:t>
       </w:r>
@@ -10930,7 +10972,7 @@
       <w:pPr>
         <w:pStyle w:val="Heading2"/>
       </w:pPr>
-      <w:bookmarkStart w:id="57" w:name="_Toc241671825"/>
+      <w:bookmarkStart w:id="57" w:name="_Toc242116445"/>
       <w:r>
         <w:t>12.3 Interpretation and Context</w:t>
       </w:r>
@@ -10950,7 +10992,7 @@
       <w:pPr>
         <w:pStyle w:val="Heading1"/>
       </w:pPr>
-      <w:bookmarkStart w:id="58" w:name="_Toc241671826"/>
+      <w:bookmarkStart w:id="58" w:name="_Toc242116446"/>
       <w:r>
         <w:lastRenderedPageBreak/>
         <w:t>13. Conclusion</w:t>
@@ -10976,7 +11018,7 @@
       <w:pPr>
         <w:pStyle w:val="Heading1"/>
       </w:pPr>
-      <w:bookmarkStart w:id="59" w:name="_Toc241671827"/>
+      <w:bookmarkStart w:id="59" w:name="_Toc242116447"/>
       <w:r>
         <w:lastRenderedPageBreak/>
         <w:t>14. Future Scope</w:t>
@@ -11032,7 +11074,7 @@
       <w:pPr>
         <w:pStyle w:val="Heading1"/>
       </w:pPr>
-      <w:bookmarkStart w:id="60" w:name="_Toc241671828"/>
+      <w:bookmarkStart w:id="60" w:name="_Toc242116448"/>
       <w:r>
         <w:lastRenderedPageBreak/>
         <w:t>REFERENCES</w:t>
@@ -11073,7 +11115,7 @@
       <w:pPr>
         <w:pStyle w:val="Heading1"/>
       </w:pPr>
-      <w:bookmarkStart w:id="61" w:name="_Toc241671829"/>
+      <w:bookmarkStart w:id="61" w:name="_Toc242116449"/>
       <w:r>
         <w:lastRenderedPageBreak/>
         <w:t>Appendix A — Source Code</w:t>
@@ -11109,7 +11151,7 @@
           <w:noProof/>
         </w:rPr>
         <w:drawing>
-          <wp:inline distT="0" distB="0" distL="0" distR="0" wp14:anchorId="60B705F6" wp14:editId="686C98D7">
+          <wp:inline distT="0" distB="0" distL="0" distR="0" wp14:anchorId="575A0CFD" wp14:editId="34B133FB">
             <wp:extent cx="5440680" cy="3343926"/>
             <wp:effectExtent l="0" t="0" r="0" b="0"/>
             <wp:docPr id="12" name="Picture 12"/>
@@ -11180,7 +11222,7 @@
           <w:noProof/>
         </w:rPr>
         <w:drawing>
-          <wp:inline distT="0" distB="0" distL="0" distR="0" wp14:anchorId="29304E38" wp14:editId="3D357337">
+          <wp:inline distT="0" distB="0" distL="0" distR="0" wp14:anchorId="0D23F782" wp14:editId="37DAE91B">
             <wp:extent cx="5440680" cy="4976130"/>
             <wp:effectExtent l="0" t="0" r="0" b="0"/>
             <wp:docPr id="13" name="Picture 13"/>
@@ -11251,7 +11293,7 @@
           <w:noProof/>
         </w:rPr>
         <w:drawing>
-          <wp:inline distT="0" distB="0" distL="0" distR="0" wp14:anchorId="4691D9A6" wp14:editId="645798E2">
+          <wp:inline distT="0" distB="0" distL="0" distR="0" wp14:anchorId="642D7118" wp14:editId="3E58A014">
             <wp:extent cx="5440680" cy="2854264"/>
             <wp:effectExtent l="0" t="0" r="0" b="0"/>
             <wp:docPr id="14" name="Picture 14"/>
@@ -11322,7 +11364,7 @@
           <w:noProof/>
         </w:rPr>
         <w:drawing>
-          <wp:inline distT="0" distB="0" distL="0" distR="0" wp14:anchorId="0F90FF4E" wp14:editId="489F07B6">
+          <wp:inline distT="0" distB="0" distL="0" distR="0" wp14:anchorId="6901EA7E" wp14:editId="098DCBB4">
             <wp:extent cx="5440680" cy="4812909"/>
             <wp:effectExtent l="0" t="0" r="0" b="0"/>
             <wp:docPr id="15" name="Picture 15"/>
@@ -11372,7 +11414,7 @@
       <w:pPr>
         <w:pStyle w:val="Heading1"/>
       </w:pPr>
-      <w:bookmarkStart w:id="62" w:name="_Toc241671830"/>
+      <w:bookmarkStart w:id="62" w:name="_Toc242116450"/>
       <w:r>
         <w:lastRenderedPageBreak/>
         <w:t>Appendix B — Paper Presentation Certificate</w:t>
@@ -11394,7 +11436,7 @@
           <w:noProof/>
         </w:rPr>
         <w:drawing>
-          <wp:inline distT="0" distB="0" distL="0" distR="0" wp14:anchorId="17F7A9AF" wp14:editId="13356CE1">
+          <wp:inline distT="0" distB="0" distL="0" distR="0" wp14:anchorId="1FCC6965" wp14:editId="7FF41996">
             <wp:extent cx="5440680" cy="3895116"/>
             <wp:effectExtent l="0" t="0" r="0" b="0"/>
             <wp:docPr id="16" name="Picture 16"/>
@@ -11439,7 +11481,7 @@
       <w:pPr>
         <w:pStyle w:val="Heading1"/>
       </w:pPr>
-      <w:bookmarkStart w:id="63" w:name="_Toc241671831"/>
+      <w:bookmarkStart w:id="63" w:name="_Toc242116451"/>
       <w:r>
         <w:lastRenderedPageBreak/>
         <w:t>Appendix C — Project Outputs</w:t>
@@ -12252,31 +12294,31 @@
       </w:rPr>
     </w:lvl>
   </w:abstractNum>
-  <w:num w:numId="1" w16cid:durableId="1978604479">
+  <w:num w:numId="1" w16cid:durableId="2093508121">
     <w:abstractNumId w:val="8"/>
   </w:num>
-  <w:num w:numId="2" w16cid:durableId="1875002881">
+  <w:num w:numId="2" w16cid:durableId="8915868">
     <w:abstractNumId w:val="6"/>
   </w:num>
-  <w:num w:numId="3" w16cid:durableId="922683226">
+  <w:num w:numId="3" w16cid:durableId="591397536">
     <w:abstractNumId w:val="5"/>
   </w:num>
-  <w:num w:numId="4" w16cid:durableId="1387148228">
+  <w:num w:numId="4" w16cid:durableId="1355424186">
     <w:abstractNumId w:val="4"/>
   </w:num>
-  <w:num w:numId="5" w16cid:durableId="716979112">
+  <w:num w:numId="5" w16cid:durableId="1718044084">
     <w:abstractNumId w:val="7"/>
   </w:num>
-  <w:num w:numId="6" w16cid:durableId="794523350">
+  <w:num w:numId="6" w16cid:durableId="1685130426">
     <w:abstractNumId w:val="3"/>
   </w:num>
-  <w:num w:numId="7" w16cid:durableId="1743409935">
+  <w:num w:numId="7" w16cid:durableId="1051269585">
     <w:abstractNumId w:val="2"/>
   </w:num>
-  <w:num w:numId="8" w16cid:durableId="1369448898">
+  <w:num w:numId="8" w16cid:durableId="862859674">
     <w:abstractNumId w:val="1"/>
   </w:num>
-  <w:num w:numId="9" w16cid:durableId="1159736489">
+  <w:num w:numId="9" w16cid:durableId="680353977">
     <w:abstractNumId w:val="0"/>
   </w:num>
 </w:numbering>
@@ -23923,7 +23965,7 @@
     <w:autoRedefine/>
     <w:uiPriority w:val="39"/>
     <w:unhideWhenUsed/>
-    <w:rsid w:val="00E34C07"/>
+    <w:rsid w:val="00AC4A0A"/>
     <w:pPr>
       <w:spacing w:after="100"/>
     </w:pPr>
@@ -23935,7 +23977,7 @@
     <w:autoRedefine/>
     <w:uiPriority w:val="39"/>
     <w:unhideWhenUsed/>
-    <w:rsid w:val="00E34C07"/>
+    <w:rsid w:val="00AC4A0A"/>
     <w:pPr>
       <w:spacing w:after="100"/>
       <w:ind w:left="240"/>
@@ -23946,7 +23988,7 @@
     <w:basedOn w:val="DefaultParagraphFont"/>
     <w:uiPriority w:val="99"/>
     <w:unhideWhenUsed/>
-    <w:rsid w:val="00E34C07"/>
+    <w:rsid w:val="00AC4A0A"/>
     <w:rPr>
       <w:color w:val="0000FF" w:themeColor="hyperlink"/>
       <w:u w:val="single"/>

</xml_diff>